<commit_message>
Präteritum/Plusquamperfekt: haben und sein im Präteritum konjugieren
Neuer Schritt vor Merksatz 9: Konjugationstabelle per Kreide-Kette, die
Klasse schreibt sie in den Hefter. Phase 4 auf 20 Minuten verlängert.

Co-Authored-By: Claude Opus 5.5 <noreply@anthropic.com>
Claude-Session: https://claude.ai/code/session_01KXvLXHMYPnCyEbMRgNaaYs
</commit_message>
<xml_diff>
--- a/Deutsch_7A/Praeteritum_Plusquamperfekt/Tafelskript_Praeteritum_Plusquamperfekt.docx
+++ b/Deutsch_7A/Praeteritum_Plusquamperfekt/Tafelskript_Praeteritum_Plusquamperfekt.docx
@@ -822,7 +822,7 @@
                 <w:sz w:val="21"/>
                 <w:szCs w:val="21"/>
               </w:rPr>
-              <w:t xml:space="preserve">15′</w:t>
+              <w:t xml:space="preserve">20′</w:t>
             </w:r>
           </w:p>
         </w:tc>
@@ -890,7 +890,7 @@
                 <w:sz w:val="21"/>
                 <w:szCs w:val="21"/>
               </w:rPr>
-              <w:t xml:space="preserve">„Ich war nervös. Ich hatte kaum geschlafen.“ – Zeitstrahl, Merksatz 9, Ü10 (Schnipsel B)</w:t>
+              <w:t xml:space="preserve">„Ich war nervös. Ich hatte kaum geschlafen.“ – Zeitstrahl, haben/sein im Präteritum konjugieren, Merksatz 9, Ü10 (Schnipsel B)</w:t>
             </w:r>
           </w:p>
         </w:tc>
@@ -1242,7 +1242,7 @@
           <w:sz w:val="21"/>
           <w:szCs w:val="21"/>
         </w:rPr>
-        <w:t xml:space="preserve">Wird es knapp, ist Phase 5 der Kern. Der Bericht kann als Hausaufgabe fertig geschrieben werden; Partner-Check und Reflexion (6, 7) sind dann der Einstieg der nächsten Stunde.</w:t>
+        <w:t xml:space="preserve">Die 90 Minuten sind damit voll verplant. Wird es knapp, ist Phase 5 der Kern. Der Bericht kann als Hausaufgabe fertig geschrieben werden; Partner-Check und Reflexion (6, 7) sind dann der Einstieg der nächsten Stunde.</w:t>
       </w:r>
     </w:p>
     <w:p>
@@ -1639,6 +1639,79 @@
                 <w:szCs w:val="20"/>
               </w:rPr>
               <w:t xml:space="preserve">Schnipsel A eingeklebt (Präteritum der Sportverben)</w:t>
+            </w:r>
+          </w:p>
+        </w:tc>
+      </w:tr>
+      <w:tr>
+        <w:trPr>
+          <w:cantSplit/>
+          <w:trHeight w:val="340" w:hRule="atLeast"/>
+        </w:trPr>
+        <w:tc>
+          <w:tcPr>
+            <w:tcW w:type="dxa" w:w="2300"/>
+            <w:tcBorders>
+              <w:top w:val="single" w:color="B9C6E8" w:sz="6"/>
+              <w:left w:val="single" w:color="B9C6E8" w:sz="6"/>
+              <w:bottom w:val="single" w:color="B9C6E8" w:sz="6"/>
+              <w:right w:val="single" w:color="B9C6E8" w:sz="6"/>
+            </w:tcBorders>
+            <w:shd w:fill="F4F7FD" w:color="auto" w:val="clear"/>
+            <w:tcMar>
+              <w:top w:type="dxa" w:w="60"/>
+              <w:left w:type="dxa" w:w="100"/>
+              <w:bottom w:type="dxa" w:w="60"/>
+              <w:right w:type="dxa" w:w="100"/>
+            </w:tcMar>
+            <w:vAlign w:val="center"/>
+          </w:tcPr>
+          <w:p>
+            <w:pPr>
+              <w:spacing w:after="0" w:before="0"/>
+            </w:pPr>
+            <w:r>
+              <w:rPr>
+                <w:rFonts w:ascii="Calibri" w:cs="Calibri" w:eastAsia="Calibri" w:hAnsi="Calibri"/>
+                <w:b/>
+                <w:bCs/>
+                <w:color w:val="1E2761"/>
+                <w:sz w:val="20"/>
+                <w:szCs w:val="20"/>
+              </w:rPr>
+              <w:t xml:space="preserve">Tabelle</w:t>
+            </w:r>
+          </w:p>
+        </w:tc>
+        <w:tc>
+          <w:tcPr>
+            <w:tcW w:type="dxa" w:w="7906"/>
+            <w:tcBorders>
+              <w:top w:val="single" w:color="B9C6E8" w:sz="6"/>
+              <w:left w:val="single" w:color="B9C6E8" w:sz="6"/>
+              <w:bottom w:val="single" w:color="B9C6E8" w:sz="6"/>
+              <w:right w:val="single" w:color="B9C6E8" w:sz="6"/>
+            </w:tcBorders>
+            <w:tcMar>
+              <w:top w:type="dxa" w:w="60"/>
+              <w:left w:type="dxa" w:w="100"/>
+              <w:bottom w:type="dxa" w:w="60"/>
+              <w:right w:type="dxa" w:w="100"/>
+            </w:tcMar>
+            <w:vAlign w:val="center"/>
+          </w:tcPr>
+          <w:p>
+            <w:pPr>
+              <w:spacing w:after="0" w:before="0"/>
+            </w:pPr>
+            <w:r>
+              <w:rPr>
+                <w:rFonts w:ascii="Calibri" w:cs="Calibri" w:eastAsia="Calibri" w:hAnsi="Calibri"/>
+                <w:color w:val="000000"/>
+                <w:sz w:val="20"/>
+                <w:szCs w:val="20"/>
+              </w:rPr>
+              <w:t xml:space="preserve">haben und sein im Präteritum (ich hatte, ich war …)</w:t>
             </w:r>
           </w:p>
         </w:tc>
@@ -6326,7 +6399,7 @@
           <w:sz w:val="20"/>
           <w:szCs w:val="20"/>
         </w:rPr>
-        <w:t xml:space="preserve">   15 Min.</w:t>
+        <w:t xml:space="preserve">   20 Min.</w:t>
       </w:r>
     </w:p>
     <w:tbl>
@@ -7022,7 +7095,7 @@
                 <w:sz w:val="21"/>
                 <w:szCs w:val="21"/>
               </w:rPr>
-              <w:t xml:space="preserve">hatte kennt die Klasse aus Merksatz 4 (haben im Präteritum), geschlafen ist ein Partizip II. Neu ist nur die Kombination.</w:t>
+              <w:t xml:space="preserve">hatte ist haben im Präteritum, geschlafen ist ein Partizip II. Damit alle hatte und war sicher bilden können, konjugieren wir beide Hilfsverben gleich vollständig.</w:t>
             </w:r>
           </w:p>
           <w:p>
@@ -7051,6 +7124,1041 @@
                 <w:szCs w:val="21"/>
               </w:rPr>
               <w:t xml:space="preserve">Auch mit sein: Wir waren früh losgefahren.</w:t>
+            </w:r>
+          </w:p>
+        </w:tc>
+      </w:tr>
+    </w:tbl>
+    <w:p>
+      <w:pPr>
+        <w:spacing w:after="40" w:before="0"/>
+      </w:pPr>
+      <w:r>
+        <w:rPr>
+          <w:rFonts w:ascii="Calibri" w:cs="Calibri" w:eastAsia="Calibri" w:hAnsi="Calibri"/>
+          <w:color w:val="000000"/>
+          <w:sz w:val="22"/>
+          <w:szCs w:val="22"/>
+        </w:rPr>
+        <w:t xml:space="preserve"/>
+      </w:r>
+    </w:p>
+    <w:tbl>
+      <w:tblPr>
+        <w:tblW w:type="dxa" w:w="10206"/>
+        <w:tblBorders>
+          <w:top w:val="single" w:color="auto" w:sz="4"/>
+          <w:left w:val="single" w:color="auto" w:sz="4"/>
+          <w:bottom w:val="single" w:color="auto" w:sz="4"/>
+          <w:right w:val="single" w:color="auto" w:sz="4"/>
+          <w:insideH w:val="single" w:color="auto" w:sz="4"/>
+          <w:insideV w:val="single" w:color="auto" w:sz="4"/>
+        </w:tblBorders>
+      </w:tblPr>
+      <w:tblGrid>
+        <w:gridCol w:w="1700"/>
+        <w:gridCol w:w="8506"/>
+      </w:tblGrid>
+      <w:tr>
+        <w:trPr>
+          <w:cantSplit/>
+        </w:trPr>
+        <w:tc>
+          <w:tcPr>
+            <w:tcW w:type="dxa" w:w="1700"/>
+            <w:tcBorders>
+              <w:top w:val="single" w:color="D5DDEE" w:sz="6"/>
+              <w:left w:val="single" w:color="D5DDEE" w:sz="6"/>
+              <w:bottom w:val="single" w:color="D5DDEE" w:sz="6"/>
+              <w:right w:val="single" w:color="D5DDEE" w:sz="6"/>
+            </w:tcBorders>
+            <w:shd w:fill="F4F7FD" w:color="auto" w:val="clear"/>
+            <w:tcMar>
+              <w:top w:type="dxa" w:w="100"/>
+              <w:left w:type="dxa" w:w="100"/>
+              <w:bottom w:type="dxa" w:w="100"/>
+              <w:right w:type="dxa" w:w="100"/>
+            </w:tcMar>
+            <w:vAlign w:val="top"/>
+          </w:tcPr>
+          <w:p>
+            <w:pPr>
+              <w:spacing w:after="10" w:before="0"/>
+            </w:pPr>
+            <w:r>
+              <w:rPr>
+                <w:rFonts w:ascii="Calibri" w:cs="Calibri" w:eastAsia="Calibri" w:hAnsi="Calibri"/>
+                <w:color w:val="5B6B8C"/>
+                <w:sz w:val="16"/>
+                <w:szCs w:val="16"/>
+              </w:rPr>
+              <w:t xml:space="preserve">Klasse</w:t>
+            </w:r>
+          </w:p>
+          <w:p>
+            <w:pPr>
+              <w:spacing w:after="0" w:before="0"/>
+            </w:pPr>
+            <w:r>
+              <w:rPr>
+                <w:rFonts w:ascii="Calibri" w:cs="Calibri" w:eastAsia="Calibri" w:hAnsi="Calibri"/>
+                <w:b/>
+                <w:bCs/>
+                <w:color w:val="1E2761"/>
+                <w:sz w:val="20"/>
+                <w:szCs w:val="20"/>
+              </w:rPr>
+              <w:t xml:space="preserve">kommt an die Tafel</w:t>
+            </w:r>
+          </w:p>
+        </w:tc>
+        <w:tc>
+          <w:tcPr>
+            <w:tcW w:type="dxa" w:w="8506"/>
+            <w:tcBorders>
+              <w:top w:val="single" w:color="D5DDEE" w:sz="6"/>
+              <w:left w:val="single" w:color="D5DDEE" w:sz="6"/>
+              <w:bottom w:val="single" w:color="D5DDEE" w:sz="6"/>
+              <w:right w:val="single" w:color="D5DDEE" w:sz="6"/>
+            </w:tcBorders>
+            <w:tcMar>
+              <w:top w:type="dxa" w:w="100"/>
+              <w:left w:type="dxa" w:w="160"/>
+              <w:bottom w:type="dxa" w:w="100"/>
+              <w:right w:type="dxa" w:w="100"/>
+            </w:tcMar>
+            <w:vAlign w:val="top"/>
+          </w:tcPr>
+          <w:p>
+            <w:pPr>
+              <w:spacing w:after="60" w:before="0"/>
+            </w:pPr>
+            <w:r>
+              <w:rPr>
+                <w:rFonts w:ascii="Calibri" w:cs="Calibri" w:eastAsia="Calibri" w:hAnsi="Calibri"/>
+                <w:b/>
+                <w:bCs/>
+                <w:color w:val="D9534F"/>
+                <w:sz w:val="20"/>
+                <w:szCs w:val="20"/>
+              </w:rPr>
+              <w:t xml:space="preserve">Ansage: </w:t>
+            </w:r>
+            <w:r>
+              <w:rPr>
+                <w:rFonts w:ascii="Calibri" w:cs="Calibri" w:eastAsia="Calibri" w:hAnsi="Calibri"/>
+                <w:i/>
+                <w:iCs/>
+                <w:color w:val="000000"/>
+                <w:sz w:val="21"/>
+                <w:szCs w:val="21"/>
+              </w:rPr>
+              <w:t xml:space="preserve">„Kreide-Kette: Wir konjugieren haben und sein im Präteritum. Wer die Kreide hat, trägt eine Form ein und gibt die Kreide weiter. Alle anderen schreiben die Tabelle ins Heft.“</w:t>
+            </w:r>
+          </w:p>
+          <w:p>
+            <w:pPr>
+              <w:spacing w:after="50" w:before="0"/>
+            </w:pPr>
+            <w:r>
+              <w:rPr>
+                <w:rFonts w:ascii="Calibri" w:cs="Calibri" w:eastAsia="Calibri" w:hAnsi="Calibri"/>
+                <w:color w:val="000000"/>
+                <w:sz w:val="21"/>
+                <w:szCs w:val="21"/>
+              </w:rPr>
+              <w:t xml:space="preserve">Die Personen und die Überschriften vorher anschreiben, die Formen trägt die Kreide-Kette ein.</w:t>
+            </w:r>
+          </w:p>
+          <w:p>
+            <w:pPr>
+              <w:spacing w:after="50" w:before="0"/>
+            </w:pPr>
+            <w:r>
+              <w:rPr>
+                <w:rFonts w:ascii="Calibri" w:cs="Calibri" w:eastAsia="Calibri" w:hAnsi="Calibri"/>
+                <w:color w:val="000000"/>
+                <w:sz w:val="21"/>
+                <w:szCs w:val="21"/>
+              </w:rPr>
+              <w:t xml:space="preserve">Stolperstellen: ihr wart (ohne e), du warst; die 1. und 3. Person Singular sind gleich (ich hatte – er hatte, ich war – sie war).</w:t>
+            </w:r>
+          </w:p>
+          <w:p>
+            <w:pPr>
+              <w:spacing w:after="50" w:before="0"/>
+            </w:pPr>
+            <w:r>
+              <w:rPr>
+                <w:rFonts w:ascii="Calibri" w:cs="Calibri" w:eastAsia="Calibri" w:hAnsi="Calibri"/>
+                <w:color w:val="000000"/>
+                <w:sz w:val="21"/>
+                <w:szCs w:val="21"/>
+              </w:rPr>
+              <w:t xml:space="preserve">Kurz nach Sportarten anwenden lassen: „Wir ___ müde.“ – „Ihr ___ gut trainiert.“</w:t>
+            </w:r>
+          </w:p>
+          <w:tbl>
+            <w:tblPr>
+              <w:tblW w:type="dxa" w:w="8166"/>
+              <w:tblBorders>
+                <w:top w:val="single" w:color="auto" w:sz="4"/>
+                <w:left w:val="single" w:color="auto" w:sz="4"/>
+                <w:bottom w:val="single" w:color="auto" w:sz="4"/>
+                <w:right w:val="single" w:color="auto" w:sz="4"/>
+                <w:insideH w:val="single" w:color="auto" w:sz="4"/>
+                <w:insideV w:val="single" w:color="auto" w:sz="4"/>
+              </w:tblBorders>
+            </w:tblPr>
+            <w:tblGrid>
+              <w:gridCol w:w="8166"/>
+            </w:tblGrid>
+            <w:tr>
+              <w:trPr>
+                <w:cantSplit/>
+              </w:trPr>
+              <w:tc>
+                <w:tcPr>
+                  <w:tcW w:type="dxa" w:w="8166"/>
+                  <w:tcBorders>
+                    <w:top w:val="single" w:color="3D4A3F" w:sz="12"/>
+                    <w:left w:val="single" w:color="3D4A3F" w:sz="12"/>
+                    <w:bottom w:val="single" w:color="3D4A3F" w:sz="12"/>
+                    <w:right w:val="single" w:color="3D4A3F" w:sz="12"/>
+                  </w:tcBorders>
+                  <w:shd w:fill="3D4A3F" w:color="auto" w:val="clear"/>
+                  <w:tcMar>
+                    <w:top w:type="dxa" w:w="30"/>
+                    <w:left w:type="dxa" w:w="100"/>
+                    <w:bottom w:type="dxa" w:w="30"/>
+                    <w:right w:type="dxa" w:w="100"/>
+                  </w:tcMar>
+                  <w:vAlign w:val="center"/>
+                </w:tcPr>
+                <w:p>
+                  <w:pPr>
+                    <w:spacing w:after="0" w:before="0"/>
+                  </w:pPr>
+                  <w:r>
+                    <w:rPr>
+                      <w:rFonts w:ascii="Calibri" w:cs="Calibri" w:eastAsia="Calibri" w:hAnsi="Calibri"/>
+                      <w:b/>
+                      <w:bCs/>
+                      <w:color w:val="FFFFFF"/>
+                      <w:sz w:val="16"/>
+                      <w:szCs w:val="16"/>
+                    </w:rPr>
+                    <w:t xml:space="preserve">TAFEL · Mitte · haben und sein im Präteritum</w:t>
+                  </w:r>
+                </w:p>
+              </w:tc>
+            </w:tr>
+            <w:tr>
+              <w:trPr>
+                <w:cantSplit/>
+              </w:trPr>
+              <w:tc>
+                <w:tcPr>
+                  <w:tcW w:type="dxa" w:w="8166"/>
+                  <w:tcBorders>
+                    <w:top w:val="single" w:color="3D4A3F" w:sz="12"/>
+                    <w:left w:val="single" w:color="3D4A3F" w:sz="12"/>
+                    <w:bottom w:val="single" w:color="3D4A3F" w:sz="12"/>
+                    <w:right w:val="single" w:color="3D4A3F" w:sz="12"/>
+                  </w:tcBorders>
+                  <w:shd w:fill="F3F6F1" w:color="auto" w:val="clear"/>
+                  <w:tcMar>
+                    <w:top w:type="dxa" w:w="100"/>
+                    <w:left w:type="dxa" w:w="160"/>
+                    <w:bottom w:type="dxa" w:w="100"/>
+                    <w:right w:type="dxa" w:w="100"/>
+                  </w:tcMar>
+                  <w:vAlign w:val="center"/>
+                </w:tcPr>
+                <w:tbl>
+                  <w:tblPr>
+                    <w:tblW w:type="dxa" w:w="5300"/>
+                    <w:tblBorders>
+                      <w:top w:val="single" w:color="auto" w:sz="4"/>
+                      <w:left w:val="single" w:color="auto" w:sz="4"/>
+                      <w:bottom w:val="single" w:color="auto" w:sz="4"/>
+                      <w:right w:val="single" w:color="auto" w:sz="4"/>
+                      <w:insideH w:val="single" w:color="auto" w:sz="4"/>
+                      <w:insideV w:val="single" w:color="auto" w:sz="4"/>
+                    </w:tblBorders>
+                  </w:tblPr>
+                  <w:tblGrid>
+                    <w:gridCol w:w="1500"/>
+                    <w:gridCol w:w="1900"/>
+                    <w:gridCol w:w="1900"/>
+                  </w:tblGrid>
+                  <w:tr>
+                    <w:trPr>
+                      <w:cantSplit/>
+                    </w:trPr>
+                    <w:tc>
+                      <w:tcPr>
+                        <w:tcW w:type="dxa" w:w="1500"/>
+                        <w:tcBorders>
+                          <w:top w:val="single" w:color="9AA59C" w:sz="4"/>
+                          <w:left w:val="single" w:color="9AA59C" w:sz="4"/>
+                          <w:bottom w:val="single" w:color="9AA59C" w:sz="4"/>
+                          <w:right w:val="single" w:color="9AA59C" w:sz="4"/>
+                        </w:tcBorders>
+                        <w:tcMar>
+                          <w:top w:type="dxa" w:w="60"/>
+                          <w:left w:type="dxa" w:w="100"/>
+                          <w:bottom w:type="dxa" w:w="60"/>
+                          <w:right w:type="dxa" w:w="100"/>
+                        </w:tcMar>
+                        <w:vAlign w:val="center"/>
+                      </w:tcPr>
+                      <w:p>
+                        <w:pPr>
+                          <w:spacing w:after="0" w:before="0"/>
+                        </w:pPr>
+                        <w:r>
+                          <w:rPr>
+                            <w:rFonts w:ascii="Cambria" w:cs="Cambria" w:eastAsia="Cambria" w:hAnsi="Cambria"/>
+                            <w:color w:val="000000"/>
+                            <w:sz w:val="22"/>
+                            <w:szCs w:val="22"/>
+                          </w:rPr>
+                          <w:t xml:space="preserve"/>
+                        </w:r>
+                      </w:p>
+                    </w:tc>
+                    <w:tc>
+                      <w:tcPr>
+                        <w:tcW w:type="dxa" w:w="1900"/>
+                        <w:tcBorders>
+                          <w:top w:val="single" w:color="9AA59C" w:sz="4"/>
+                          <w:left w:val="single" w:color="9AA59C" w:sz="4"/>
+                          <w:bottom w:val="single" w:color="9AA59C" w:sz="4"/>
+                          <w:right w:val="single" w:color="9AA59C" w:sz="4"/>
+                        </w:tcBorders>
+                        <w:tcMar>
+                          <w:top w:type="dxa" w:w="60"/>
+                          <w:left w:type="dxa" w:w="100"/>
+                          <w:bottom w:type="dxa" w:w="60"/>
+                          <w:right w:type="dxa" w:w="100"/>
+                        </w:tcMar>
+                        <w:vAlign w:val="center"/>
+                      </w:tcPr>
+                      <w:p>
+                        <w:pPr>
+                          <w:spacing w:after="0" w:before="0"/>
+                          <w:jc w:val="center"/>
+                        </w:pPr>
+                        <w:r>
+                          <w:rPr>
+                            <w:rFonts w:ascii="Cambria" w:cs="Cambria" w:eastAsia="Cambria" w:hAnsi="Cambria"/>
+                            <w:b/>
+                            <w:bCs/>
+                            <w:color w:val="D9534F"/>
+                            <w:sz w:val="22"/>
+                            <w:szCs w:val="22"/>
+                          </w:rPr>
+                          <w:t xml:space="preserve">haben</w:t>
+                        </w:r>
+                      </w:p>
+                    </w:tc>
+                    <w:tc>
+                      <w:tcPr>
+                        <w:tcW w:type="dxa" w:w="1900"/>
+                        <w:tcBorders>
+                          <w:top w:val="single" w:color="9AA59C" w:sz="4"/>
+                          <w:left w:val="single" w:color="9AA59C" w:sz="4"/>
+                          <w:bottom w:val="single" w:color="9AA59C" w:sz="4"/>
+                          <w:right w:val="single" w:color="9AA59C" w:sz="4"/>
+                        </w:tcBorders>
+                        <w:tcMar>
+                          <w:top w:type="dxa" w:w="60"/>
+                          <w:left w:type="dxa" w:w="100"/>
+                          <w:bottom w:type="dxa" w:w="60"/>
+                          <w:right w:type="dxa" w:w="100"/>
+                        </w:tcMar>
+                        <w:vAlign w:val="center"/>
+                      </w:tcPr>
+                      <w:p>
+                        <w:pPr>
+                          <w:spacing w:after="0" w:before="0"/>
+                          <w:jc w:val="center"/>
+                        </w:pPr>
+                        <w:r>
+                          <w:rPr>
+                            <w:rFonts w:ascii="Cambria" w:cs="Cambria" w:eastAsia="Cambria" w:hAnsi="Cambria"/>
+                            <w:b/>
+                            <w:bCs/>
+                            <w:color w:val="D9534F"/>
+                            <w:sz w:val="22"/>
+                            <w:szCs w:val="22"/>
+                          </w:rPr>
+                          <w:t xml:space="preserve">sein</w:t>
+                        </w:r>
+                      </w:p>
+                    </w:tc>
+                  </w:tr>
+                  <w:tr>
+                    <w:trPr>
+                      <w:cantSplit/>
+                    </w:trPr>
+                    <w:tc>
+                      <w:tcPr>
+                        <w:tcW w:type="dxa" w:w="1500"/>
+                        <w:tcBorders>
+                          <w:top w:val="single" w:color="9AA59C" w:sz="4"/>
+                          <w:left w:val="single" w:color="9AA59C" w:sz="4"/>
+                          <w:bottom w:val="single" w:color="9AA59C" w:sz="4"/>
+                          <w:right w:val="single" w:color="9AA59C" w:sz="4"/>
+                        </w:tcBorders>
+                        <w:tcMar>
+                          <w:top w:type="dxa" w:w="15"/>
+                          <w:left w:type="dxa" w:w="100"/>
+                          <w:bottom w:type="dxa" w:w="15"/>
+                          <w:right w:type="dxa" w:w="100"/>
+                        </w:tcMar>
+                        <w:vAlign w:val="center"/>
+                      </w:tcPr>
+                      <w:p>
+                        <w:pPr>
+                          <w:spacing w:after="0" w:before="0"/>
+                        </w:pPr>
+                        <w:r>
+                          <w:rPr>
+                            <w:rFonts w:ascii="Cambria" w:cs="Cambria" w:eastAsia="Cambria" w:hAnsi="Cambria"/>
+                            <w:color w:val="5B6B8C"/>
+                            <w:sz w:val="22"/>
+                            <w:szCs w:val="22"/>
+                          </w:rPr>
+                          <w:t xml:space="preserve">ich</w:t>
+                        </w:r>
+                      </w:p>
+                    </w:tc>
+                    <w:tc>
+                      <w:tcPr>
+                        <w:tcW w:type="dxa" w:w="1900"/>
+                        <w:tcBorders>
+                          <w:top w:val="single" w:color="9AA59C" w:sz="4"/>
+                          <w:left w:val="single" w:color="9AA59C" w:sz="4"/>
+                          <w:bottom w:val="single" w:color="9AA59C" w:sz="4"/>
+                          <w:right w:val="single" w:color="9AA59C" w:sz="4"/>
+                        </w:tcBorders>
+                        <w:tcMar>
+                          <w:top w:type="dxa" w:w="15"/>
+                          <w:left w:type="dxa" w:w="100"/>
+                          <w:bottom w:type="dxa" w:w="15"/>
+                          <w:right w:type="dxa" w:w="100"/>
+                        </w:tcMar>
+                        <w:vAlign w:val="center"/>
+                      </w:tcPr>
+                      <w:p>
+                        <w:pPr>
+                          <w:spacing w:after="0" w:before="0"/>
+                          <w:jc w:val="center"/>
+                        </w:pPr>
+                        <w:r>
+                          <w:rPr>
+                            <w:rFonts w:ascii="Cambria" w:cs="Cambria" w:eastAsia="Cambria" w:hAnsi="Cambria"/>
+                            <w:color w:val="000000"/>
+                            <w:sz w:val="22"/>
+                            <w:szCs w:val="22"/>
+                          </w:rPr>
+                          <w:t xml:space="preserve">hatte</w:t>
+                        </w:r>
+                      </w:p>
+                    </w:tc>
+                    <w:tc>
+                      <w:tcPr>
+                        <w:tcW w:type="dxa" w:w="1900"/>
+                        <w:tcBorders>
+                          <w:top w:val="single" w:color="9AA59C" w:sz="4"/>
+                          <w:left w:val="single" w:color="9AA59C" w:sz="4"/>
+                          <w:bottom w:val="single" w:color="9AA59C" w:sz="4"/>
+                          <w:right w:val="single" w:color="9AA59C" w:sz="4"/>
+                        </w:tcBorders>
+                        <w:tcMar>
+                          <w:top w:type="dxa" w:w="15"/>
+                          <w:left w:type="dxa" w:w="100"/>
+                          <w:bottom w:type="dxa" w:w="15"/>
+                          <w:right w:type="dxa" w:w="100"/>
+                        </w:tcMar>
+                        <w:vAlign w:val="center"/>
+                      </w:tcPr>
+                      <w:p>
+                        <w:pPr>
+                          <w:spacing w:after="0" w:before="0"/>
+                          <w:jc w:val="center"/>
+                        </w:pPr>
+                        <w:r>
+                          <w:rPr>
+                            <w:rFonts w:ascii="Cambria" w:cs="Cambria" w:eastAsia="Cambria" w:hAnsi="Cambria"/>
+                            <w:color w:val="000000"/>
+                            <w:sz w:val="22"/>
+                            <w:szCs w:val="22"/>
+                          </w:rPr>
+                          <w:t xml:space="preserve">war</w:t>
+                        </w:r>
+                      </w:p>
+                    </w:tc>
+                  </w:tr>
+                  <w:tr>
+                    <w:trPr>
+                      <w:cantSplit/>
+                    </w:trPr>
+                    <w:tc>
+                      <w:tcPr>
+                        <w:tcW w:type="dxa" w:w="1500"/>
+                        <w:tcBorders>
+                          <w:top w:val="single" w:color="9AA59C" w:sz="4"/>
+                          <w:left w:val="single" w:color="9AA59C" w:sz="4"/>
+                          <w:bottom w:val="single" w:color="9AA59C" w:sz="4"/>
+                          <w:right w:val="single" w:color="9AA59C" w:sz="4"/>
+                        </w:tcBorders>
+                        <w:tcMar>
+                          <w:top w:type="dxa" w:w="15"/>
+                          <w:left w:type="dxa" w:w="100"/>
+                          <w:bottom w:type="dxa" w:w="15"/>
+                          <w:right w:type="dxa" w:w="100"/>
+                        </w:tcMar>
+                        <w:vAlign w:val="center"/>
+                      </w:tcPr>
+                      <w:p>
+                        <w:pPr>
+                          <w:spacing w:after="0" w:before="0"/>
+                        </w:pPr>
+                        <w:r>
+                          <w:rPr>
+                            <w:rFonts w:ascii="Cambria" w:cs="Cambria" w:eastAsia="Cambria" w:hAnsi="Cambria"/>
+                            <w:color w:val="5B6B8C"/>
+                            <w:sz w:val="22"/>
+                            <w:szCs w:val="22"/>
+                          </w:rPr>
+                          <w:t xml:space="preserve">du</w:t>
+                        </w:r>
+                      </w:p>
+                    </w:tc>
+                    <w:tc>
+                      <w:tcPr>
+                        <w:tcW w:type="dxa" w:w="1900"/>
+                        <w:tcBorders>
+                          <w:top w:val="single" w:color="9AA59C" w:sz="4"/>
+                          <w:left w:val="single" w:color="9AA59C" w:sz="4"/>
+                          <w:bottom w:val="single" w:color="9AA59C" w:sz="4"/>
+                          <w:right w:val="single" w:color="9AA59C" w:sz="4"/>
+                        </w:tcBorders>
+                        <w:tcMar>
+                          <w:top w:type="dxa" w:w="15"/>
+                          <w:left w:type="dxa" w:w="100"/>
+                          <w:bottom w:type="dxa" w:w="15"/>
+                          <w:right w:type="dxa" w:w="100"/>
+                        </w:tcMar>
+                        <w:vAlign w:val="center"/>
+                      </w:tcPr>
+                      <w:p>
+                        <w:pPr>
+                          <w:spacing w:after="0" w:before="0"/>
+                          <w:jc w:val="center"/>
+                        </w:pPr>
+                        <w:r>
+                          <w:rPr>
+                            <w:rFonts w:ascii="Cambria" w:cs="Cambria" w:eastAsia="Cambria" w:hAnsi="Cambria"/>
+                            <w:color w:val="000000"/>
+                            <w:sz w:val="22"/>
+                            <w:szCs w:val="22"/>
+                          </w:rPr>
+                          <w:t xml:space="preserve">hattest</w:t>
+                        </w:r>
+                      </w:p>
+                    </w:tc>
+                    <w:tc>
+                      <w:tcPr>
+                        <w:tcW w:type="dxa" w:w="1900"/>
+                        <w:tcBorders>
+                          <w:top w:val="single" w:color="9AA59C" w:sz="4"/>
+                          <w:left w:val="single" w:color="9AA59C" w:sz="4"/>
+                          <w:bottom w:val="single" w:color="9AA59C" w:sz="4"/>
+                          <w:right w:val="single" w:color="9AA59C" w:sz="4"/>
+                        </w:tcBorders>
+                        <w:tcMar>
+                          <w:top w:type="dxa" w:w="15"/>
+                          <w:left w:type="dxa" w:w="100"/>
+                          <w:bottom w:type="dxa" w:w="15"/>
+                          <w:right w:type="dxa" w:w="100"/>
+                        </w:tcMar>
+                        <w:vAlign w:val="center"/>
+                      </w:tcPr>
+                      <w:p>
+                        <w:pPr>
+                          <w:spacing w:after="0" w:before="0"/>
+                          <w:jc w:val="center"/>
+                        </w:pPr>
+                        <w:r>
+                          <w:rPr>
+                            <w:rFonts w:ascii="Cambria" w:cs="Cambria" w:eastAsia="Cambria" w:hAnsi="Cambria"/>
+                            <w:color w:val="000000"/>
+                            <w:sz w:val="22"/>
+                            <w:szCs w:val="22"/>
+                          </w:rPr>
+                          <w:t xml:space="preserve">warst</w:t>
+                        </w:r>
+                      </w:p>
+                    </w:tc>
+                  </w:tr>
+                  <w:tr>
+                    <w:trPr>
+                      <w:cantSplit/>
+                    </w:trPr>
+                    <w:tc>
+                      <w:tcPr>
+                        <w:tcW w:type="dxa" w:w="1500"/>
+                        <w:tcBorders>
+                          <w:top w:val="single" w:color="9AA59C" w:sz="4"/>
+                          <w:left w:val="single" w:color="9AA59C" w:sz="4"/>
+                          <w:bottom w:val="single" w:color="9AA59C" w:sz="4"/>
+                          <w:right w:val="single" w:color="9AA59C" w:sz="4"/>
+                        </w:tcBorders>
+                        <w:tcMar>
+                          <w:top w:type="dxa" w:w="15"/>
+                          <w:left w:type="dxa" w:w="100"/>
+                          <w:bottom w:type="dxa" w:w="15"/>
+                          <w:right w:type="dxa" w:w="100"/>
+                        </w:tcMar>
+                        <w:vAlign w:val="center"/>
+                      </w:tcPr>
+                      <w:p>
+                        <w:pPr>
+                          <w:spacing w:after="0" w:before="0"/>
+                        </w:pPr>
+                        <w:r>
+                          <w:rPr>
+                            <w:rFonts w:ascii="Cambria" w:cs="Cambria" w:eastAsia="Cambria" w:hAnsi="Cambria"/>
+                            <w:color w:val="5B6B8C"/>
+                            <w:sz w:val="22"/>
+                            <w:szCs w:val="22"/>
+                          </w:rPr>
+                          <w:t xml:space="preserve">er/sie/es</w:t>
+                        </w:r>
+                      </w:p>
+                    </w:tc>
+                    <w:tc>
+                      <w:tcPr>
+                        <w:tcW w:type="dxa" w:w="1900"/>
+                        <w:tcBorders>
+                          <w:top w:val="single" w:color="9AA59C" w:sz="4"/>
+                          <w:left w:val="single" w:color="9AA59C" w:sz="4"/>
+                          <w:bottom w:val="single" w:color="9AA59C" w:sz="4"/>
+                          <w:right w:val="single" w:color="9AA59C" w:sz="4"/>
+                        </w:tcBorders>
+                        <w:tcMar>
+                          <w:top w:type="dxa" w:w="15"/>
+                          <w:left w:type="dxa" w:w="100"/>
+                          <w:bottom w:type="dxa" w:w="15"/>
+                          <w:right w:type="dxa" w:w="100"/>
+                        </w:tcMar>
+                        <w:vAlign w:val="center"/>
+                      </w:tcPr>
+                      <w:p>
+                        <w:pPr>
+                          <w:spacing w:after="0" w:before="0"/>
+                          <w:jc w:val="center"/>
+                        </w:pPr>
+                        <w:r>
+                          <w:rPr>
+                            <w:rFonts w:ascii="Cambria" w:cs="Cambria" w:eastAsia="Cambria" w:hAnsi="Cambria"/>
+                            <w:color w:val="000000"/>
+                            <w:sz w:val="22"/>
+                            <w:szCs w:val="22"/>
+                          </w:rPr>
+                          <w:t xml:space="preserve">hatte</w:t>
+                        </w:r>
+                      </w:p>
+                    </w:tc>
+                    <w:tc>
+                      <w:tcPr>
+                        <w:tcW w:type="dxa" w:w="1900"/>
+                        <w:tcBorders>
+                          <w:top w:val="single" w:color="9AA59C" w:sz="4"/>
+                          <w:left w:val="single" w:color="9AA59C" w:sz="4"/>
+                          <w:bottom w:val="single" w:color="9AA59C" w:sz="4"/>
+                          <w:right w:val="single" w:color="9AA59C" w:sz="4"/>
+                        </w:tcBorders>
+                        <w:tcMar>
+                          <w:top w:type="dxa" w:w="15"/>
+                          <w:left w:type="dxa" w:w="100"/>
+                          <w:bottom w:type="dxa" w:w="15"/>
+                          <w:right w:type="dxa" w:w="100"/>
+                        </w:tcMar>
+                        <w:vAlign w:val="center"/>
+                      </w:tcPr>
+                      <w:p>
+                        <w:pPr>
+                          <w:spacing w:after="0" w:before="0"/>
+                          <w:jc w:val="center"/>
+                        </w:pPr>
+                        <w:r>
+                          <w:rPr>
+                            <w:rFonts w:ascii="Cambria" w:cs="Cambria" w:eastAsia="Cambria" w:hAnsi="Cambria"/>
+                            <w:color w:val="000000"/>
+                            <w:sz w:val="22"/>
+                            <w:szCs w:val="22"/>
+                          </w:rPr>
+                          <w:t xml:space="preserve">war</w:t>
+                        </w:r>
+                      </w:p>
+                    </w:tc>
+                  </w:tr>
+                  <w:tr>
+                    <w:trPr>
+                      <w:cantSplit/>
+                    </w:trPr>
+                    <w:tc>
+                      <w:tcPr>
+                        <w:tcW w:type="dxa" w:w="1500"/>
+                        <w:tcBorders>
+                          <w:top w:val="single" w:color="9AA59C" w:sz="4"/>
+                          <w:left w:val="single" w:color="9AA59C" w:sz="4"/>
+                          <w:bottom w:val="single" w:color="9AA59C" w:sz="4"/>
+                          <w:right w:val="single" w:color="9AA59C" w:sz="4"/>
+                        </w:tcBorders>
+                        <w:tcMar>
+                          <w:top w:type="dxa" w:w="15"/>
+                          <w:left w:type="dxa" w:w="100"/>
+                          <w:bottom w:type="dxa" w:w="15"/>
+                          <w:right w:type="dxa" w:w="100"/>
+                        </w:tcMar>
+                        <w:vAlign w:val="center"/>
+                      </w:tcPr>
+                      <w:p>
+                        <w:pPr>
+                          <w:spacing w:after="0" w:before="0"/>
+                        </w:pPr>
+                        <w:r>
+                          <w:rPr>
+                            <w:rFonts w:ascii="Cambria" w:cs="Cambria" w:eastAsia="Cambria" w:hAnsi="Cambria"/>
+                            <w:color w:val="5B6B8C"/>
+                            <w:sz w:val="22"/>
+                            <w:szCs w:val="22"/>
+                          </w:rPr>
+                          <w:t xml:space="preserve">wir</w:t>
+                        </w:r>
+                      </w:p>
+                    </w:tc>
+                    <w:tc>
+                      <w:tcPr>
+                        <w:tcW w:type="dxa" w:w="1900"/>
+                        <w:tcBorders>
+                          <w:top w:val="single" w:color="9AA59C" w:sz="4"/>
+                          <w:left w:val="single" w:color="9AA59C" w:sz="4"/>
+                          <w:bottom w:val="single" w:color="9AA59C" w:sz="4"/>
+                          <w:right w:val="single" w:color="9AA59C" w:sz="4"/>
+                        </w:tcBorders>
+                        <w:tcMar>
+                          <w:top w:type="dxa" w:w="15"/>
+                          <w:left w:type="dxa" w:w="100"/>
+                          <w:bottom w:type="dxa" w:w="15"/>
+                          <w:right w:type="dxa" w:w="100"/>
+                        </w:tcMar>
+                        <w:vAlign w:val="center"/>
+                      </w:tcPr>
+                      <w:p>
+                        <w:pPr>
+                          <w:spacing w:after="0" w:before="0"/>
+                          <w:jc w:val="center"/>
+                        </w:pPr>
+                        <w:r>
+                          <w:rPr>
+                            <w:rFonts w:ascii="Cambria" w:cs="Cambria" w:eastAsia="Cambria" w:hAnsi="Cambria"/>
+                            <w:color w:val="000000"/>
+                            <w:sz w:val="22"/>
+                            <w:szCs w:val="22"/>
+                          </w:rPr>
+                          <w:t xml:space="preserve">hatten</w:t>
+                        </w:r>
+                      </w:p>
+                    </w:tc>
+                    <w:tc>
+                      <w:tcPr>
+                        <w:tcW w:type="dxa" w:w="1900"/>
+                        <w:tcBorders>
+                          <w:top w:val="single" w:color="9AA59C" w:sz="4"/>
+                          <w:left w:val="single" w:color="9AA59C" w:sz="4"/>
+                          <w:bottom w:val="single" w:color="9AA59C" w:sz="4"/>
+                          <w:right w:val="single" w:color="9AA59C" w:sz="4"/>
+                        </w:tcBorders>
+                        <w:tcMar>
+                          <w:top w:type="dxa" w:w="15"/>
+                          <w:left w:type="dxa" w:w="100"/>
+                          <w:bottom w:type="dxa" w:w="15"/>
+                          <w:right w:type="dxa" w:w="100"/>
+                        </w:tcMar>
+                        <w:vAlign w:val="center"/>
+                      </w:tcPr>
+                      <w:p>
+                        <w:pPr>
+                          <w:spacing w:after="0" w:before="0"/>
+                          <w:jc w:val="center"/>
+                        </w:pPr>
+                        <w:r>
+                          <w:rPr>
+                            <w:rFonts w:ascii="Cambria" w:cs="Cambria" w:eastAsia="Cambria" w:hAnsi="Cambria"/>
+                            <w:color w:val="000000"/>
+                            <w:sz w:val="22"/>
+                            <w:szCs w:val="22"/>
+                          </w:rPr>
+                          <w:t xml:space="preserve">waren</w:t>
+                        </w:r>
+                      </w:p>
+                    </w:tc>
+                  </w:tr>
+                  <w:tr>
+                    <w:trPr>
+                      <w:cantSplit/>
+                    </w:trPr>
+                    <w:tc>
+                      <w:tcPr>
+                        <w:tcW w:type="dxa" w:w="1500"/>
+                        <w:tcBorders>
+                          <w:top w:val="single" w:color="9AA59C" w:sz="4"/>
+                          <w:left w:val="single" w:color="9AA59C" w:sz="4"/>
+                          <w:bottom w:val="single" w:color="9AA59C" w:sz="4"/>
+                          <w:right w:val="single" w:color="9AA59C" w:sz="4"/>
+                        </w:tcBorders>
+                        <w:tcMar>
+                          <w:top w:type="dxa" w:w="15"/>
+                          <w:left w:type="dxa" w:w="100"/>
+                          <w:bottom w:type="dxa" w:w="15"/>
+                          <w:right w:type="dxa" w:w="100"/>
+                        </w:tcMar>
+                        <w:vAlign w:val="center"/>
+                      </w:tcPr>
+                      <w:p>
+                        <w:pPr>
+                          <w:spacing w:after="0" w:before="0"/>
+                        </w:pPr>
+                        <w:r>
+                          <w:rPr>
+                            <w:rFonts w:ascii="Cambria" w:cs="Cambria" w:eastAsia="Cambria" w:hAnsi="Cambria"/>
+                            <w:color w:val="5B6B8C"/>
+                            <w:sz w:val="22"/>
+                            <w:szCs w:val="22"/>
+                          </w:rPr>
+                          <w:t xml:space="preserve">ihr</w:t>
+                        </w:r>
+                      </w:p>
+                    </w:tc>
+                    <w:tc>
+                      <w:tcPr>
+                        <w:tcW w:type="dxa" w:w="1900"/>
+                        <w:tcBorders>
+                          <w:top w:val="single" w:color="9AA59C" w:sz="4"/>
+                          <w:left w:val="single" w:color="9AA59C" w:sz="4"/>
+                          <w:bottom w:val="single" w:color="9AA59C" w:sz="4"/>
+                          <w:right w:val="single" w:color="9AA59C" w:sz="4"/>
+                        </w:tcBorders>
+                        <w:tcMar>
+                          <w:top w:type="dxa" w:w="15"/>
+                          <w:left w:type="dxa" w:w="100"/>
+                          <w:bottom w:type="dxa" w:w="15"/>
+                          <w:right w:type="dxa" w:w="100"/>
+                        </w:tcMar>
+                        <w:vAlign w:val="center"/>
+                      </w:tcPr>
+                      <w:p>
+                        <w:pPr>
+                          <w:spacing w:after="0" w:before="0"/>
+                          <w:jc w:val="center"/>
+                        </w:pPr>
+                        <w:r>
+                          <w:rPr>
+                            <w:rFonts w:ascii="Cambria" w:cs="Cambria" w:eastAsia="Cambria" w:hAnsi="Cambria"/>
+                            <w:color w:val="000000"/>
+                            <w:sz w:val="22"/>
+                            <w:szCs w:val="22"/>
+                          </w:rPr>
+                          <w:t xml:space="preserve">hattet</w:t>
+                        </w:r>
+                      </w:p>
+                    </w:tc>
+                    <w:tc>
+                      <w:tcPr>
+                        <w:tcW w:type="dxa" w:w="1900"/>
+                        <w:tcBorders>
+                          <w:top w:val="single" w:color="9AA59C" w:sz="4"/>
+                          <w:left w:val="single" w:color="9AA59C" w:sz="4"/>
+                          <w:bottom w:val="single" w:color="9AA59C" w:sz="4"/>
+                          <w:right w:val="single" w:color="9AA59C" w:sz="4"/>
+                        </w:tcBorders>
+                        <w:tcMar>
+                          <w:top w:type="dxa" w:w="15"/>
+                          <w:left w:type="dxa" w:w="100"/>
+                          <w:bottom w:type="dxa" w:w="15"/>
+                          <w:right w:type="dxa" w:w="100"/>
+                        </w:tcMar>
+                        <w:vAlign w:val="center"/>
+                      </w:tcPr>
+                      <w:p>
+                        <w:pPr>
+                          <w:spacing w:after="0" w:before="0"/>
+                          <w:jc w:val="center"/>
+                        </w:pPr>
+                        <w:r>
+                          <w:rPr>
+                            <w:rFonts w:ascii="Cambria" w:cs="Cambria" w:eastAsia="Cambria" w:hAnsi="Cambria"/>
+                            <w:color w:val="000000"/>
+                            <w:sz w:val="22"/>
+                            <w:szCs w:val="22"/>
+                          </w:rPr>
+                          <w:t xml:space="preserve">wart</w:t>
+                        </w:r>
+                      </w:p>
+                    </w:tc>
+                  </w:tr>
+                  <w:tr>
+                    <w:trPr>
+                      <w:cantSplit/>
+                    </w:trPr>
+                    <w:tc>
+                      <w:tcPr>
+                        <w:tcW w:type="dxa" w:w="1500"/>
+                        <w:tcBorders>
+                          <w:top w:val="single" w:color="9AA59C" w:sz="4"/>
+                          <w:left w:val="single" w:color="9AA59C" w:sz="4"/>
+                          <w:bottom w:val="single" w:color="9AA59C" w:sz="4"/>
+                          <w:right w:val="single" w:color="9AA59C" w:sz="4"/>
+                        </w:tcBorders>
+                        <w:tcMar>
+                          <w:top w:type="dxa" w:w="15"/>
+                          <w:left w:type="dxa" w:w="100"/>
+                          <w:bottom w:type="dxa" w:w="15"/>
+                          <w:right w:type="dxa" w:w="100"/>
+                        </w:tcMar>
+                        <w:vAlign w:val="center"/>
+                      </w:tcPr>
+                      <w:p>
+                        <w:pPr>
+                          <w:spacing w:after="0" w:before="0"/>
+                        </w:pPr>
+                        <w:r>
+                          <w:rPr>
+                            <w:rFonts w:ascii="Cambria" w:cs="Cambria" w:eastAsia="Cambria" w:hAnsi="Cambria"/>
+                            <w:color w:val="5B6B8C"/>
+                            <w:sz w:val="22"/>
+                            <w:szCs w:val="22"/>
+                          </w:rPr>
+                          <w:t xml:space="preserve">sie/Sie</w:t>
+                        </w:r>
+                      </w:p>
+                    </w:tc>
+                    <w:tc>
+                      <w:tcPr>
+                        <w:tcW w:type="dxa" w:w="1900"/>
+                        <w:tcBorders>
+                          <w:top w:val="single" w:color="9AA59C" w:sz="4"/>
+                          <w:left w:val="single" w:color="9AA59C" w:sz="4"/>
+                          <w:bottom w:val="single" w:color="9AA59C" w:sz="4"/>
+                          <w:right w:val="single" w:color="9AA59C" w:sz="4"/>
+                        </w:tcBorders>
+                        <w:tcMar>
+                          <w:top w:type="dxa" w:w="15"/>
+                          <w:left w:type="dxa" w:w="100"/>
+                          <w:bottom w:type="dxa" w:w="15"/>
+                          <w:right w:type="dxa" w:w="100"/>
+                        </w:tcMar>
+                        <w:vAlign w:val="center"/>
+                      </w:tcPr>
+                      <w:p>
+                        <w:pPr>
+                          <w:spacing w:after="0" w:before="0"/>
+                          <w:jc w:val="center"/>
+                        </w:pPr>
+                        <w:r>
+                          <w:rPr>
+                            <w:rFonts w:ascii="Cambria" w:cs="Cambria" w:eastAsia="Cambria" w:hAnsi="Cambria"/>
+                            <w:color w:val="000000"/>
+                            <w:sz w:val="22"/>
+                            <w:szCs w:val="22"/>
+                          </w:rPr>
+                          <w:t xml:space="preserve">hatten</w:t>
+                        </w:r>
+                      </w:p>
+                    </w:tc>
+                    <w:tc>
+                      <w:tcPr>
+                        <w:tcW w:type="dxa" w:w="1900"/>
+                        <w:tcBorders>
+                          <w:top w:val="single" w:color="9AA59C" w:sz="4"/>
+                          <w:left w:val="single" w:color="9AA59C" w:sz="4"/>
+                          <w:bottom w:val="single" w:color="9AA59C" w:sz="4"/>
+                          <w:right w:val="single" w:color="9AA59C" w:sz="4"/>
+                        </w:tcBorders>
+                        <w:tcMar>
+                          <w:top w:type="dxa" w:w="15"/>
+                          <w:left w:type="dxa" w:w="100"/>
+                          <w:bottom w:type="dxa" w:w="15"/>
+                          <w:right w:type="dxa" w:w="100"/>
+                        </w:tcMar>
+                        <w:vAlign w:val="center"/>
+                      </w:tcPr>
+                      <w:p>
+                        <w:pPr>
+                          <w:spacing w:after="0" w:before="0"/>
+                          <w:jc w:val="center"/>
+                        </w:pPr>
+                        <w:r>
+                          <w:rPr>
+                            <w:rFonts w:ascii="Cambria" w:cs="Cambria" w:eastAsia="Cambria" w:hAnsi="Cambria"/>
+                            <w:color w:val="000000"/>
+                            <w:sz w:val="22"/>
+                            <w:szCs w:val="22"/>
+                          </w:rPr>
+                          <w:t xml:space="preserve">waren</w:t>
+                        </w:r>
+                      </w:p>
+                    </w:tc>
+                  </w:tr>
+                </w:tbl>
+                <w:p/>
+              </w:tc>
+            </w:tr>
+          </w:tbl>
+          <w:p>
+            <w:pPr>
+              <w:spacing w:after="20" w:before="0"/>
+            </w:pPr>
+            <w:r>
+              <w:rPr>
+                <w:rFonts w:ascii="Calibri" w:cs="Calibri" w:eastAsia="Calibri" w:hAnsi="Calibri"/>
+                <w:color w:val="000000"/>
+                <w:sz w:val="22"/>
+                <w:szCs w:val="22"/>
+              </w:rPr>
+              <w:t xml:space="preserve"/>
+            </w:r>
+          </w:p>
+          <w:p>
+            <w:pPr>
+              <w:spacing w:after="0" w:before="0"/>
+            </w:pPr>
+            <w:r>
+              <w:rPr>
+                <w:rFonts w:ascii="Calibri" w:cs="Calibri" w:eastAsia="Calibri" w:hAnsi="Calibri"/>
+                <w:b/>
+                <w:bCs/>
+                <w:color w:val="5B6B8C"/>
+                <w:sz w:val="19"/>
+                <w:szCs w:val="19"/>
+              </w:rPr>
+              <w:t xml:space="preserve">Lösung: </w:t>
+            </w:r>
+            <w:r>
+              <w:rPr>
+                <w:rFonts w:ascii="Calibri" w:cs="Calibri" w:eastAsia="Calibri" w:hAnsi="Calibri"/>
+                <w:color w:val="5B6B8C"/>
+                <w:sz w:val="19"/>
+                <w:szCs w:val="19"/>
+              </w:rPr>
+              <w:t xml:space="preserve">hatte · hattest · hatte · hatten · hattet · hatten | war · warst · war · waren · wart · waren</w:t>
             </w:r>
           </w:p>
         </w:tc>

</xml_diff>

<commit_message>
Präteritum/Plusquamperfekt: nur Ü11 drucken, Rest ins Heft
Druckvorlage mit 4 Schreibrahmen Ü11 pro A4 ersetzt die Schnipsel A–D.
Tafelskript: Ü9, Ü10 und Partner-Check laufen im Heft bzw. an der
Tafel. Reflexionslog angepasst.

Co-Authored-By: Claude Opus 5.5 <noreply@anthropic.com>
Claude-Session: https://claude.ai/code/session_01KXvLXHMYPnCyEbMRgNaaYs
</commit_message>
<xml_diff>
--- a/Deutsch_7A/Praeteritum_Plusquamperfekt/Tafelskript_Praeteritum_Plusquamperfekt.docx
+++ b/Deutsch_7A/Praeteritum_Plusquamperfekt/Tafelskript_Praeteritum_Plusquamperfekt.docx
@@ -782,7 +782,7 @@
                 <w:sz w:val="21"/>
                 <w:szCs w:val="21"/>
               </w:rPr>
-              <w:t xml:space="preserve">Schnipsel A eintragen, Vergleich per Kreide-Kette</w:t>
+              <w:t xml:space="preserve">Verben ins Heft schreiben und ergänzen, Vergleich per Kreide-Kette</w:t>
             </w:r>
           </w:p>
         </w:tc>
@@ -890,7 +890,7 @@
                 <w:sz w:val="21"/>
                 <w:szCs w:val="21"/>
               </w:rPr>
-              <w:t xml:space="preserve">„Ich war nervös. Ich hatte kaum geschlafen.“ – Zeitstrahl, haben/sein im Präteritum konjugieren, Merksatz 9, Ü10 (Schnipsel B)</w:t>
+              <w:t xml:space="preserve">„Ich war nervös. Ich hatte kaum geschlafen.“ – Zeitstrahl, haben/sein im Präteritum konjugieren, Merksatz 9, Ü10 ins Heft</w:t>
             </w:r>
           </w:p>
         </w:tc>
@@ -998,7 +998,7 @@
                 <w:sz w:val="21"/>
                 <w:szCs w:val="21"/>
               </w:rPr>
-              <w:t xml:space="preserve">eigenen Bericht ins Heft schreiben (Schnipsel C als Rahmen)</w:t>
+              <w:t xml:space="preserve">eigenen Bericht ins Heft schreiben (gedruckter Schreibrahmen)</w:t>
             </w:r>
           </w:p>
         </w:tc>
@@ -1106,7 +1106,7 @@
                 <w:sz w:val="21"/>
                 <w:szCs w:val="21"/>
               </w:rPr>
-              <w:t xml:space="preserve">Schnipsel D: unterstreichen, markieren, drei Prüffragen</w:t>
+              <w:t xml:space="preserve">unterstreichen, markieren, drei Prüffragen (an der Tafel)</w:t>
             </w:r>
           </w:p>
         </w:tc>
@@ -1638,7 +1638,7 @@
                 <w:sz w:val="20"/>
                 <w:szCs w:val="20"/>
               </w:rPr>
-              <w:t xml:space="preserve">Schnipsel A eingeklebt (Präteritum der Sportverben)</w:t>
+              <w:t xml:space="preserve">Infinitiv → Präteritum der Sportverben (z. B. werfen → warf*)</w:t>
             </w:r>
           </w:p>
         </w:tc>
@@ -1857,7 +1857,7 @@
                 <w:sz w:val="20"/>
                 <w:szCs w:val="20"/>
               </w:rPr>
-              <w:t xml:space="preserve">Schnipsel B eingeklebt (Was war vorher?)</w:t>
+              <w:t xml:space="preserve">nur Nummer + Plusquamperfekt: 1 hatte trainiert …</w:t>
             </w:r>
           </w:p>
         </w:tc>
@@ -2031,7 +2031,7 @@
           <w:sz w:val="21"/>
           <w:szCs w:val="21"/>
         </w:rPr>
-        <w:t xml:space="preserve">Kopiervorlage „Schnipsel“ (2 Seiten, je 2 Schüler pro A4 – halbe Klassenstärke kopieren und durchschneiden) · Kreide Rot, Gelb · Schüler: Heft, Kleber, Schere, Buntstifte Rot, Gelb, Grün</w:t>
+        <w:t xml:space="preserve">Schreibrahmen Ü11 (4 Stück pro A4 – ein Viertel der Klassenstärke kopieren und zerschneiden) · Kreide Rot, Gelb · Schüler: Heft, Buntstifte Rot, Gelb, Grün</w:t>
       </w:r>
     </w:p>
     <w:p>
@@ -5783,7 +5783,7 @@
           <w:sz w:val="28"/>
           <w:szCs w:val="28"/>
         </w:rPr>
-        <w:t xml:space="preserve">Ü9 Präteritum der Sportverben (Schnipsel A)</w:t>
+        <w:t xml:space="preserve">Ü9 Präteritum der Sportverben</w:t>
       </w:r>
       <w:r>
         <w:rPr>
@@ -5907,7 +5907,7 @@
                 <w:sz w:val="21"/>
                 <w:szCs w:val="21"/>
               </w:rPr>
-              <w:t xml:space="preserve">„Jetzt arbeitet ihr allein. Ihr bekommt Schnipsel A. Tragt die Präteritumformen ein und markiert die unregelmäßigen mit einem Stern. Fünf Minuten. Danach einkleben.“</w:t>
+              <w:t xml:space="preserve">„Jetzt arbeitet ihr allein. Die Aufgabe steht rechts an der Tafel: Ü9. Schreibt die Verben untereinander ins Heft und ergänzt die Präteritumform. Fünf Minuten.“</w:t>
             </w:r>
           </w:p>
           <w:tbl>
@@ -6011,7 +6011,7 @@
                       <w:sz w:val="21"/>
                       <w:szCs w:val="21"/>
                     </w:rPr>
-                    <w:t xml:space="preserve">Klebe Schnipsel A als Ü9 ins Heft.</w:t>
+                    <w:t xml:space="preserve">Schreibe Ü9 an den Rand.</w:t>
                   </w:r>
                 </w:p>
                 <w:p>
@@ -6038,7 +6038,7 @@
                       <w:sz w:val="21"/>
                       <w:szCs w:val="21"/>
                     </w:rPr>
-                    <w:t xml:space="preserve">Trage die Präteritumform ein (ich …).</w:t>
+                    <w:t xml:space="preserve">Schreibe jedes Verb ab und ergänze die Präteritumform: werfen → ich warf.</w:t>
                   </w:r>
                 </w:p>
                 <w:p>
@@ -6093,7 +6093,7 @@
                       <w:sz w:val="20"/>
                       <w:szCs w:val="20"/>
                     </w:rPr>
-                    <w:t xml:space="preserve">Verben auf dem Schnipsel: werfen, fallen, greifen, halten, fangen, treffen, laufen, heben, reißen, stoßen, gewinnen, verlieren, kämpfen, starten, trainieren, sein, haben</w:t>
+                    <w:t xml:space="preserve">werfen, fallen, greifen, halten, fangen, treffen, laufen, heben, reißen, stoßen, gewinnen, verlieren, kämpfen, starten, trainieren, sein, haben</w:t>
                   </w:r>
                 </w:p>
                 <w:p>
@@ -8772,7 +8772,7 @@
                 <w:sz w:val="21"/>
                 <w:szCs w:val="21"/>
               </w:rPr>
-              <w:t xml:space="preserve">„Jetzt arbeitet ihr allein: Schnipsel B, Ü10. Ergänzt in jedem zweiten Satz das Plusquamperfekt. Fünf Minuten.“</w:t>
+              <w:t xml:space="preserve">„Jetzt arbeitet ihr allein: Ü10. Ihr schreibt die Sätze nicht ab – nur die Nummer und das Plusquamperfekt. Fünf Minuten.“</w:t>
             </w:r>
           </w:p>
           <w:tbl>
@@ -8825,7 +8825,7 @@
                       <w:sz w:val="16"/>
                       <w:szCs w:val="16"/>
                     </w:rPr>
-                    <w:t xml:space="preserve">TAFEL · rechts · Ü10 Was war vorher? (Schnipsel B)</w:t>
+                    <w:t xml:space="preserve">TAFEL · rechts · Ü10 Was war vorher?</w:t>
                   </w:r>
                 </w:p>
               </w:tc>
@@ -8876,7 +8876,7 @@
                       <w:sz w:val="21"/>
                       <w:szCs w:val="21"/>
                     </w:rPr>
-                    <w:t xml:space="preserve">Klebe Schnipsel B als Ü10 ins Heft.</w:t>
+                    <w:t xml:space="preserve">Schreibe Ü10 an den Rand.</w:t>
                   </w:r>
                 </w:p>
                 <w:p>
@@ -8903,7 +8903,7 @@
                       <w:sz w:val="21"/>
                       <w:szCs w:val="21"/>
                     </w:rPr>
-                    <w:t xml:space="preserve">Ergänze das Plusquamperfekt mit dem Verb in Klammern.</w:t>
+                    <w:t xml:space="preserve">Schreibe nur Nummer und Plusquamperfekt: 1 hatte … trainiert.</w:t>
                   </w:r>
                 </w:p>
                 <w:p>
@@ -9295,7 +9295,7 @@
           <w:sz w:val="28"/>
           <w:szCs w:val="28"/>
         </w:rPr>
-        <w:t xml:space="preserve">Ü11 Mein erster Wettkampf (Schnipsel C)</w:t>
+        <w:t xml:space="preserve">Ü11 Mein erster Wettkampf (gedruckter Schreibrahmen)</w:t>
       </w:r>
       <w:r>
         <w:rPr>
@@ -9419,7 +9419,7 @@
                 <w:sz w:val="21"/>
                 <w:szCs w:val="21"/>
               </w:rPr>
-              <w:t xml:space="preserve">„Jetzt schreibt ihr allein euren eigenen Bericht für die Vereinszeitung – ins Heft, als Ü11. Schnipsel C hilft euch mit Satzanfängen. Zwölf Minuten.“</w:t>
+              <w:t xml:space="preserve">„Jetzt schreibt ihr allein euren eigenen Bericht für die Vereinszeitung – ins Heft, als Ü11. Der Schreibrahmen hilft euch mit Satzanfängen und Wörtern. Zwölf Minuten.“</w:t>
             </w:r>
           </w:p>
           <w:p>
@@ -9433,7 +9433,7 @@
                 <w:sz w:val="21"/>
                 <w:szCs w:val="21"/>
               </w:rPr>
-              <w:t xml:space="preserve">Schnipsel C nicht einkleben, sondern neben das Heft legen – geschrieben wird ins Heft.</w:t>
+              <w:t xml:space="preserve">Den Schreibrahmen neben das Heft legen (oder nach der Stunde einkleben) – geschrieben wird ins Heft.</w:t>
             </w:r>
           </w:p>
           <w:p>
@@ -9635,7 +9635,7 @@
                       <w:sz w:val="20"/>
                       <w:szCs w:val="20"/>
                     </w:rPr>
-                    <w:t xml:space="preserve">Hilfe: Satzanfänge und Bausteine auf Schnipsel C, Präteritumformen auf Schnipsel A (Ü9).</w:t>
+                    <w:t xml:space="preserve">Hilfe: Satzanfänge und Bausteine auf dem Schreibrahmen, Präteritumformen in Ü9.</w:t>
                   </w:r>
                 </w:p>
                 <w:p>
@@ -9747,7 +9747,7 @@
           <w:sz w:val="28"/>
           <w:szCs w:val="28"/>
         </w:rPr>
-        <w:t xml:space="preserve">Partner-Check (Schnipsel D)</w:t>
+        <w:t xml:space="preserve">Partner-Check</w:t>
       </w:r>
       <w:r>
         <w:rPr>
@@ -9871,7 +9871,7 @@
                 <w:sz w:val="21"/>
                 <w:szCs w:val="21"/>
               </w:rPr>
-              <w:t xml:space="preserve">„Jetzt arbeitet ihr zu zweit. Tauscht die Hefte. Ihr prüft den Bericht eures Partners mit Schnipsel D.“</w:t>
+              <w:t xml:space="preserve">„Jetzt arbeitet ihr zu zweit. Tauscht die Hefte. Ihr prüft den Bericht eures Partners. Die Fragen stehen rechts an der Tafel.“</w:t>
             </w:r>
           </w:p>
           <w:p>
@@ -10043,7 +10043,7 @@
                       <w:sz w:val="21"/>
                       <w:szCs w:val="21"/>
                     </w:rPr>
-                    <w:t xml:space="preserve">Beantworte die drei Fragen auf Schnipsel D und gib das Heft zurück.</w:t>
+                    <w:t xml:space="preserve">Schreibe unter den Text: die Antworten auf die drei Fragen (ja/nein) und einen Satz „Gut gelungen ist …“. Gib das Heft zurück.</w:t>
                   </w:r>
                 </w:p>
                 <w:p>

</xml_diff>